<commit_message>
Implement basic input and abilitysystem.
Implement skill cast ability.
Implement skill combo ability.
</commit_message>
<xml_diff>
--- a/Document/GameSystem.docx
+++ b/Document/GameSystem.docx
@@ -406,7 +406,6 @@
             </w:r>
           </w:hyperlink>
         </w:p>
-        <w:bookmarkStart w:id="0" w:name="_GoBack"/>
         <w:p>
           <w:pPr>
             <w:pStyle w:val="TOC2"/>
@@ -419,111 +418,65 @@
               <w:lang w:eastAsia="zh-CN"/>
             </w:rPr>
           </w:pPr>
-          <w:r>
-            <w:rPr>
-              <w:rStyle w:val="Hyperlink"/>
-              <w:noProof/>
-            </w:rPr>
-            <w:fldChar w:fldCharType="begin"/>
-          </w:r>
-          <w:r>
-            <w:rPr>
-              <w:rStyle w:val="Hyperlink"/>
-              <w:noProof/>
-            </w:rPr>
-            <w:instrText xml:space="preserve"> </w:instrText>
-          </w:r>
-          <w:r>
-            <w:rPr>
-              <w:noProof/>
-            </w:rPr>
-            <w:instrText>HYPERLINK \l "_Toc183950349"</w:instrText>
-          </w:r>
-          <w:r>
-            <w:rPr>
-              <w:rStyle w:val="Hyperlink"/>
-              <w:noProof/>
-            </w:rPr>
-            <w:instrText xml:space="preserve"> </w:instrText>
-          </w:r>
-          <w:r>
-            <w:rPr>
-              <w:rStyle w:val="Hyperlink"/>
-              <w:noProof/>
-            </w:rPr>
-          </w:r>
-          <w:r>
-            <w:rPr>
-              <w:rStyle w:val="Hyperlink"/>
-              <w:noProof/>
-            </w:rPr>
-            <w:fldChar w:fldCharType="separate"/>
-          </w:r>
-          <w:r>
-            <w:rPr>
-              <w:rStyle w:val="Hyperlink"/>
-              <w:rFonts w:hint="eastAsia"/>
-              <w:noProof/>
-            </w:rPr>
-            <w:t>目标选择</w:t>
-          </w:r>
-          <w:r>
-            <w:rPr>
-              <w:noProof/>
-              <w:webHidden/>
-            </w:rPr>
-            <w:tab/>
-          </w:r>
-          <w:r>
-            <w:rPr>
-              <w:noProof/>
-              <w:webHidden/>
-            </w:rPr>
-            <w:fldChar w:fldCharType="begin"/>
-          </w:r>
-          <w:r>
-            <w:rPr>
-              <w:noProof/>
-              <w:webHidden/>
-            </w:rPr>
-            <w:instrText xml:space="preserve"> PAGEREF _Toc183950349 \h </w:instrText>
-          </w:r>
-          <w:r>
-            <w:rPr>
-              <w:noProof/>
-              <w:webHidden/>
-            </w:rPr>
-          </w:r>
-          <w:r>
-            <w:rPr>
-              <w:noProof/>
-              <w:webHidden/>
-            </w:rPr>
-            <w:fldChar w:fldCharType="separate"/>
-          </w:r>
-          <w:r>
-            <w:rPr>
-              <w:noProof/>
-              <w:webHidden/>
-            </w:rPr>
-            <w:t>2</w:t>
-          </w:r>
-          <w:r>
-            <w:rPr>
-              <w:noProof/>
-              <w:webHidden/>
-            </w:rPr>
-            <w:fldChar w:fldCharType="end"/>
-          </w:r>
-          <w:r>
-            <w:rPr>
-              <w:rStyle w:val="Hyperlink"/>
-              <w:noProof/>
-            </w:rPr>
-            <w:fldChar w:fldCharType="end"/>
-          </w:r>
+          <w:hyperlink w:anchor="_Toc183950349" w:history="1">
+            <w:r>
+              <w:rPr>
+                <w:rStyle w:val="Hyperlink"/>
+                <w:rFonts w:hint="eastAsia"/>
+                <w:noProof/>
+              </w:rPr>
+              <w:t>目标选择</w:t>
+            </w:r>
+            <w:r>
+              <w:rPr>
+                <w:noProof/>
+                <w:webHidden/>
+              </w:rPr>
+              <w:tab/>
+            </w:r>
+            <w:r>
+              <w:rPr>
+                <w:noProof/>
+                <w:webHidden/>
+              </w:rPr>
+              <w:fldChar w:fldCharType="begin"/>
+            </w:r>
+            <w:r>
+              <w:rPr>
+                <w:noProof/>
+                <w:webHidden/>
+              </w:rPr>
+              <w:instrText xml:space="preserve"> PAGEREF _Toc183950349 \h </w:instrText>
+            </w:r>
+            <w:r>
+              <w:rPr>
+                <w:noProof/>
+                <w:webHidden/>
+              </w:rPr>
+            </w:r>
+            <w:r>
+              <w:rPr>
+                <w:noProof/>
+                <w:webHidden/>
+              </w:rPr>
+              <w:fldChar w:fldCharType="separate"/>
+            </w:r>
+            <w:r>
+              <w:rPr>
+                <w:noProof/>
+                <w:webHidden/>
+              </w:rPr>
+              <w:t>2</w:t>
+            </w:r>
+            <w:r>
+              <w:rPr>
+                <w:noProof/>
+                <w:webHidden/>
+              </w:rPr>
+              <w:fldChar w:fldCharType="end"/>
+            </w:r>
+          </w:hyperlink>
         </w:p>
-        <w:bookmarkEnd w:id="0"/>
         <w:p>
           <w:pPr>
             <w:pStyle w:val="TOC3"/>
@@ -536,109 +489,64 @@
               <w:lang w:eastAsia="zh-CN"/>
             </w:rPr>
           </w:pPr>
-          <w:r>
-            <w:rPr>
-              <w:rStyle w:val="Hyperlink"/>
-              <w:noProof/>
-            </w:rPr>
-            <w:fldChar w:fldCharType="begin"/>
-          </w:r>
-          <w:r>
-            <w:rPr>
-              <w:rStyle w:val="Hyperlink"/>
-              <w:noProof/>
-            </w:rPr>
-            <w:instrText xml:space="preserve"> </w:instrText>
-          </w:r>
-          <w:r>
-            <w:rPr>
-              <w:noProof/>
-            </w:rPr>
-            <w:instrText>HYPERLINK \l "_Toc183950350"</w:instrText>
-          </w:r>
-          <w:r>
-            <w:rPr>
-              <w:rStyle w:val="Hyperlink"/>
-              <w:noProof/>
-            </w:rPr>
-            <w:instrText xml:space="preserve"> </w:instrText>
-          </w:r>
-          <w:r>
-            <w:rPr>
-              <w:rStyle w:val="Hyperlink"/>
-              <w:noProof/>
-            </w:rPr>
-          </w:r>
-          <w:r>
-            <w:rPr>
-              <w:rStyle w:val="Hyperlink"/>
-              <w:noProof/>
-            </w:rPr>
-            <w:fldChar w:fldCharType="separate"/>
-          </w:r>
-          <w:r>
-            <w:rPr>
-              <w:rStyle w:val="Hyperlink"/>
-              <w:rFonts w:hint="eastAsia"/>
-              <w:noProof/>
-            </w:rPr>
-            <w:t>普通状态</w:t>
-          </w:r>
-          <w:r>
-            <w:rPr>
-              <w:noProof/>
-              <w:webHidden/>
-            </w:rPr>
-            <w:tab/>
-          </w:r>
-          <w:r>
-            <w:rPr>
-              <w:noProof/>
-              <w:webHidden/>
-            </w:rPr>
-            <w:fldChar w:fldCharType="begin"/>
-          </w:r>
-          <w:r>
-            <w:rPr>
-              <w:noProof/>
-              <w:webHidden/>
-            </w:rPr>
-            <w:instrText xml:space="preserve"> PAGEREF _Toc183950350 \h </w:instrText>
-          </w:r>
-          <w:r>
-            <w:rPr>
-              <w:noProof/>
-              <w:webHidden/>
-            </w:rPr>
-          </w:r>
-          <w:r>
-            <w:rPr>
-              <w:noProof/>
-              <w:webHidden/>
-            </w:rPr>
-            <w:fldChar w:fldCharType="separate"/>
-          </w:r>
-          <w:r>
-            <w:rPr>
-              <w:noProof/>
-              <w:webHidden/>
-            </w:rPr>
-            <w:t>3</w:t>
-          </w:r>
-          <w:r>
-            <w:rPr>
-              <w:noProof/>
-              <w:webHidden/>
-            </w:rPr>
-            <w:fldChar w:fldCharType="end"/>
-          </w:r>
-          <w:r>
-            <w:rPr>
-              <w:rStyle w:val="Hyperlink"/>
-              <w:noProof/>
-            </w:rPr>
-            <w:fldChar w:fldCharType="end"/>
-          </w:r>
+          <w:hyperlink w:anchor="_Toc183950350" w:history="1">
+            <w:r>
+              <w:rPr>
+                <w:rStyle w:val="Hyperlink"/>
+                <w:rFonts w:hint="eastAsia"/>
+                <w:noProof/>
+              </w:rPr>
+              <w:t>普通状态</w:t>
+            </w:r>
+            <w:r>
+              <w:rPr>
+                <w:noProof/>
+                <w:webHidden/>
+              </w:rPr>
+              <w:tab/>
+            </w:r>
+            <w:r>
+              <w:rPr>
+                <w:noProof/>
+                <w:webHidden/>
+              </w:rPr>
+              <w:fldChar w:fldCharType="begin"/>
+            </w:r>
+            <w:r>
+              <w:rPr>
+                <w:noProof/>
+                <w:webHidden/>
+              </w:rPr>
+              <w:instrText xml:space="preserve"> PAGEREF _Toc183950350 \h </w:instrText>
+            </w:r>
+            <w:r>
+              <w:rPr>
+                <w:noProof/>
+                <w:webHidden/>
+              </w:rPr>
+            </w:r>
+            <w:r>
+              <w:rPr>
+                <w:noProof/>
+                <w:webHidden/>
+              </w:rPr>
+              <w:fldChar w:fldCharType="separate"/>
+            </w:r>
+            <w:r>
+              <w:rPr>
+                <w:noProof/>
+                <w:webHidden/>
+              </w:rPr>
+              <w:t>3</w:t>
+            </w:r>
+            <w:r>
+              <w:rPr>
+                <w:noProof/>
+                <w:webHidden/>
+              </w:rPr>
+              <w:fldChar w:fldCharType="end"/>
+            </w:r>
+          </w:hyperlink>
         </w:p>
         <w:p>
           <w:pPr>
@@ -1796,7 +1704,7 @@
       <w:pPr>
         <w:pStyle w:val="Header1"/>
       </w:pPr>
-      <w:bookmarkStart w:id="1" w:name="_Toc183950344"/>
+      <w:bookmarkStart w:id="0" w:name="_Toc183950344"/>
       <w:r>
         <w:rPr>
           <w:rFonts w:hint="eastAsia"/>
@@ -1804,91 +1712,91 @@
         <w:lastRenderedPageBreak/>
         <w:t>登陆界面</w:t>
       </w:r>
+      <w:bookmarkEnd w:id="0"/>
+    </w:p>
+    <w:p>
+      <w:pPr>
+        <w:pStyle w:val="Header1"/>
+      </w:pPr>
+      <w:bookmarkStart w:id="1" w:name="_Toc183950345"/>
+      <w:r>
+        <w:rPr>
+          <w:rFonts w:hint="eastAsia"/>
+        </w:rPr>
+        <w:t>通常模式</w:t>
+      </w:r>
       <w:bookmarkEnd w:id="1"/>
     </w:p>
     <w:p>
       <w:pPr>
+        <w:pStyle w:val="Header2"/>
+      </w:pPr>
+      <w:bookmarkStart w:id="2" w:name="_Toc183950346"/>
+      <w:r>
+        <w:rPr>
+          <w:rFonts w:hint="eastAsia"/>
+        </w:rPr>
+        <w:t>按键操控</w:t>
+      </w:r>
+      <w:bookmarkEnd w:id="2"/>
+    </w:p>
+    <w:p>
+      <w:pPr>
+        <w:rPr>
+          <w:rFonts w:eastAsia="宋体" w:cs="Arial"/>
+        </w:rPr>
+      </w:pPr>
+      <w:r>
+        <w:rPr>
+          <w:rFonts w:eastAsia="宋体" w:cs="Arial" w:hint="eastAsia"/>
+        </w:rPr>
+        <w:t>左</w:t>
+      </w:r>
+      <w:r>
+        <w:rPr>
+          <w:rFonts w:eastAsia="宋体" w:cs="Arial" w:hint="eastAsia"/>
+        </w:rPr>
+        <w:t>摇杆控制人物移动</w:t>
+      </w:r>
+    </w:p>
+    <w:p>
+      <w:pPr>
+        <w:rPr>
+          <w:rFonts w:eastAsia="宋体" w:cs="Arial"/>
+        </w:rPr>
+      </w:pPr>
+      <w:r>
+        <w:rPr>
+          <w:rFonts w:eastAsia="宋体" w:cs="Arial" w:hint="eastAsia"/>
+        </w:rPr>
+        <w:t>右摇杆控制摄像机角度</w:t>
+      </w:r>
+    </w:p>
+    <w:p>
+      <w:pPr>
         <w:pStyle w:val="Header1"/>
       </w:pPr>
-      <w:bookmarkStart w:id="2" w:name="_Toc183950345"/>
-      <w:r>
-        <w:rPr>
-          <w:rFonts w:hint="eastAsia"/>
-        </w:rPr>
-        <w:t>通常模式</w:t>
-      </w:r>
-      <w:bookmarkEnd w:id="2"/>
+      <w:bookmarkStart w:id="3" w:name="_Toc183950347"/>
+      <w:r>
+        <w:rPr>
+          <w:rFonts w:hint="eastAsia"/>
+        </w:rPr>
+        <w:t>战斗系统</w:t>
+      </w:r>
+      <w:bookmarkEnd w:id="3"/>
     </w:p>
     <w:p>
       <w:pPr>
         <w:pStyle w:val="Header2"/>
       </w:pPr>
-      <w:bookmarkStart w:id="3" w:name="_Toc183950346"/>
+      <w:bookmarkStart w:id="4" w:name="_Toc183950348"/>
       <w:r>
         <w:rPr>
           <w:rFonts w:hint="eastAsia"/>
         </w:rPr>
         <w:t>按键操控</w:t>
       </w:r>
-      <w:bookmarkEnd w:id="3"/>
-    </w:p>
-    <w:p>
-      <w:pPr>
-        <w:rPr>
-          <w:rFonts w:eastAsia="宋体" w:cs="Arial"/>
-        </w:rPr>
-      </w:pPr>
-      <w:r>
-        <w:rPr>
-          <w:rFonts w:eastAsia="宋体" w:cs="Arial" w:hint="eastAsia"/>
-        </w:rPr>
-        <w:t>左</w:t>
-      </w:r>
-      <w:r>
-        <w:rPr>
-          <w:rFonts w:eastAsia="宋体" w:cs="Arial" w:hint="eastAsia"/>
-        </w:rPr>
-        <w:t>摇杆控制人物移动</w:t>
-      </w:r>
-    </w:p>
-    <w:p>
-      <w:pPr>
-        <w:rPr>
-          <w:rFonts w:eastAsia="宋体" w:cs="Arial"/>
-        </w:rPr>
-      </w:pPr>
-      <w:r>
-        <w:rPr>
-          <w:rFonts w:eastAsia="宋体" w:cs="Arial" w:hint="eastAsia"/>
-        </w:rPr>
-        <w:t>右摇杆控制摄像机角度</w:t>
-      </w:r>
-    </w:p>
-    <w:p>
-      <w:pPr>
-        <w:pStyle w:val="Header1"/>
-      </w:pPr>
-      <w:bookmarkStart w:id="4" w:name="_Toc183950347"/>
-      <w:r>
-        <w:rPr>
-          <w:rFonts w:hint="eastAsia"/>
-        </w:rPr>
-        <w:t>战斗系统</w:t>
-      </w:r>
       <w:bookmarkEnd w:id="4"/>
-    </w:p>
-    <w:p>
-      <w:pPr>
-        <w:pStyle w:val="Header2"/>
-      </w:pPr>
-      <w:bookmarkStart w:id="5" w:name="_Toc183950348"/>
-      <w:r>
-        <w:rPr>
-          <w:rFonts w:hint="eastAsia"/>
-        </w:rPr>
-        <w:t>按键操控</w:t>
-      </w:r>
-      <w:bookmarkEnd w:id="5"/>
     </w:p>
     <w:p>
       <w:r>
@@ -2122,14 +2030,14 @@
       <w:pPr>
         <w:pStyle w:val="Header2"/>
       </w:pPr>
-      <w:bookmarkStart w:id="6" w:name="_Toc183950349"/>
+      <w:bookmarkStart w:id="5" w:name="_Toc183950349"/>
       <w:r>
         <w:rPr>
           <w:rFonts w:hint="eastAsia"/>
         </w:rPr>
         <w:t>目标选择</w:t>
       </w:r>
-      <w:bookmarkEnd w:id="6"/>
+      <w:bookmarkEnd w:id="5"/>
     </w:p>
     <w:p>
       <w:r>
@@ -2144,13 +2052,58 @@
       <w:pPr>
         <w:pStyle w:val="Header3"/>
       </w:pPr>
-      <w:bookmarkStart w:id="7" w:name="_Toc183950350"/>
+      <w:bookmarkStart w:id="6" w:name="_Toc183950350"/>
       <w:r>
         <w:rPr>
           <w:rFonts w:hint="eastAsia"/>
         </w:rPr>
         <w:t>普通状态</w:t>
       </w:r>
+      <w:bookmarkEnd w:id="6"/>
+    </w:p>
+    <w:p>
+      <w:r>
+        <w:rPr>
+          <w:rFonts w:hint="eastAsia"/>
+        </w:rPr>
+        <w:t>可选择的目标为屏幕内可见的敌方角色</w:t>
+      </w:r>
+    </w:p>
+    <w:p>
+      <w:r>
+        <w:rPr>
+          <w:rFonts w:hint="eastAsia"/>
+        </w:rPr>
+        <w:t>在没有目标的状态下，按任意目标选择键，选择的目标为距离角色最近，屏幕内最靠近中间的敌方角色</w:t>
+      </w:r>
+    </w:p>
+    <w:p>
+      <w:r>
+        <w:rPr>
+          <w:rFonts w:hint="eastAsia"/>
+        </w:rPr>
+        <w:t>在没有目标的状态下，如果靠近可选择目标，也会自动选择目标</w:t>
+      </w:r>
+    </w:p>
+    <w:p>
+      <w:r>
+        <w:rPr>
+          <w:rFonts w:hint="eastAsia"/>
+        </w:rPr>
+        <w:t>在有目标的状态下，则按照方位和距离，从左至右或者从右至左按顺序切换</w:t>
+      </w:r>
+    </w:p>
+    <w:p>
+      <w:pPr>
+        <w:pStyle w:val="Header3"/>
+      </w:pPr>
+      <w:bookmarkStart w:id="7" w:name="_Toc183950351"/>
+      <w:r>
+        <w:rPr>
+          <w:rFonts w:hint="eastAsia"/>
+        </w:rPr>
+        <w:t>战斗状态</w:t>
+      </w:r>
       <w:bookmarkEnd w:id="7"/>
     </w:p>
     <w:p>
@@ -2158,80 +2111,35 @@
         <w:rPr>
           <w:rFonts w:hint="eastAsia"/>
         </w:rPr>
-        <w:t>可选择的目标为屏幕内可见的敌方角色</w:t>
-      </w:r>
-    </w:p>
-    <w:p>
-      <w:r>
-        <w:rPr>
-          <w:rFonts w:hint="eastAsia"/>
-        </w:rPr>
-        <w:t>在没有目标的状态下，按任意目标选择键，选择的目标为距离角色最近，屏幕内最靠近中间的敌方角色</w:t>
-      </w:r>
-    </w:p>
-    <w:p>
-      <w:r>
-        <w:rPr>
-          <w:rFonts w:hint="eastAsia"/>
-        </w:rPr>
-        <w:t>在没有目标的状态下，如果靠近可选择目标，也会自动选择目标</w:t>
-      </w:r>
-    </w:p>
-    <w:p>
-      <w:r>
-        <w:rPr>
-          <w:rFonts w:hint="eastAsia"/>
-        </w:rPr>
-        <w:t>在有目标的状态下，则按照方位和距离，从左至右或者从右至左按顺序切换</w:t>
-      </w:r>
-    </w:p>
-    <w:p>
-      <w:pPr>
-        <w:pStyle w:val="Header3"/>
-      </w:pPr>
-      <w:bookmarkStart w:id="8" w:name="_Toc183950351"/>
-      <w:r>
-        <w:rPr>
-          <w:rFonts w:hint="eastAsia"/>
-        </w:rPr>
-        <w:t>战斗状态</w:t>
+        <w:t>可选择的目标为</w:t>
+      </w:r>
+      <w:r>
+        <w:rPr>
+          <w:rFonts w:hint="eastAsia"/>
+        </w:rPr>
+        <w:t>与已经战斗的敌方角色</w:t>
+      </w:r>
+    </w:p>
+    <w:p>
+      <w:r>
+        <w:rPr>
+          <w:rFonts w:hint="eastAsia"/>
+        </w:rPr>
+        <w:t>则按照方位和距离，从左至右或者从右至左按顺序切换</w:t>
+      </w:r>
+    </w:p>
+    <w:p>
+      <w:pPr>
+        <w:pStyle w:val="Header2"/>
+      </w:pPr>
+      <w:bookmarkStart w:id="8" w:name="_Toc183950352"/>
+      <w:r>
+        <w:rPr>
+          <w:rFonts w:hint="eastAsia"/>
+        </w:rPr>
+        <w:t>普通攻击</w:t>
       </w:r>
       <w:bookmarkEnd w:id="8"/>
-    </w:p>
-    <w:p>
-      <w:r>
-        <w:rPr>
-          <w:rFonts w:hint="eastAsia"/>
-        </w:rPr>
-        <w:t>可选择的目标为</w:t>
-      </w:r>
-      <w:r>
-        <w:rPr>
-          <w:rFonts w:hint="eastAsia"/>
-        </w:rPr>
-        <w:t>与已经战斗的敌方角色</w:t>
-      </w:r>
-    </w:p>
-    <w:p>
-      <w:r>
-        <w:rPr>
-          <w:rFonts w:hint="eastAsia"/>
-        </w:rPr>
-        <w:t>则按照方位和距离，从左至右或者从右至左按顺序切换</w:t>
-      </w:r>
-    </w:p>
-    <w:p>
-      <w:pPr>
-        <w:pStyle w:val="Header2"/>
-      </w:pPr>
-      <w:bookmarkStart w:id="9" w:name="_Toc183950352"/>
-      <w:r>
-        <w:rPr>
-          <w:rFonts w:hint="eastAsia"/>
-        </w:rPr>
-        <w:t>普通攻击</w:t>
-      </w:r>
-      <w:bookmarkEnd w:id="9"/>
     </w:p>
     <w:p>
       <w:r>
@@ -2271,9 +2179,6 @@
           <w:ilvl w:val="0"/>
           <w:numId w:val="4"/>
         </w:numPr>
-        <w:rPr>
-          <w:rFonts w:hint="eastAsia"/>
-        </w:rPr>
       </w:pPr>
       <w:r>
         <w:rPr>
@@ -2286,13 +2191,42 @@
       <w:pPr>
         <w:pStyle w:val="Header2"/>
       </w:pPr>
-      <w:bookmarkStart w:id="10" w:name="_Toc183950353"/>
+      <w:bookmarkStart w:id="9" w:name="_Toc183950353"/>
       <w:r>
         <w:rPr>
           <w:rFonts w:hint="eastAsia"/>
         </w:rPr>
         <w:t>弱点系统</w:t>
       </w:r>
+      <w:bookmarkEnd w:id="9"/>
+    </w:p>
+    <w:p>
+      <w:r>
+        <w:rPr>
+          <w:rFonts w:hint="eastAsia"/>
+        </w:rPr>
+        <w:t>角色可以带有多个弱点</w:t>
+      </w:r>
+    </w:p>
+    <w:p>
+      <w:r>
+        <w:rPr>
+          <w:rFonts w:hint="eastAsia"/>
+        </w:rPr>
+        <w:t>弱点只能一个一个触发</w:t>
+      </w:r>
+    </w:p>
+    <w:p>
+      <w:pPr>
+        <w:pStyle w:val="Header3"/>
+      </w:pPr>
+      <w:bookmarkStart w:id="10" w:name="_Toc183950354"/>
+      <w:r>
+        <w:rPr>
+          <w:rFonts w:hint="eastAsia"/>
+        </w:rPr>
+        <w:t>弱点击破</w:t>
+      </w:r>
       <w:bookmarkEnd w:id="10"/>
     </w:p>
     <w:p>
@@ -2300,108 +2234,79 @@
         <w:rPr>
           <w:rFonts w:hint="eastAsia"/>
         </w:rPr>
-        <w:t>角色可以带有多个弱点</w:t>
-      </w:r>
-    </w:p>
-    <w:p>
-      <w:r>
-        <w:rPr>
-          <w:rFonts w:hint="eastAsia"/>
-        </w:rPr>
-        <w:t>弱点只能一个一个触发</w:t>
+        <w:t>弱点有暴露值：</w:t>
+      </w:r>
+      <w:r>
+        <w:rPr>
+          <w:rFonts w:hint="eastAsia"/>
+        </w:rPr>
+        <w:t>0</w:t>
+      </w:r>
+      <w:r>
+        <w:t>-100</w:t>
+      </w:r>
+    </w:p>
+    <w:p>
+      <w:r>
+        <w:rPr>
+          <w:rFonts w:hint="eastAsia"/>
+        </w:rPr>
+        <w:t>当一个弱点的暴露值为</w:t>
+      </w:r>
+      <w:r>
+        <w:rPr>
+          <w:rFonts w:hint="eastAsia"/>
+        </w:rPr>
+        <w:t>1</w:t>
+      </w:r>
+      <w:r>
+        <w:t>0</w:t>
+      </w:r>
+      <w:r>
+        <w:rPr>
+          <w:rFonts w:hint="eastAsia"/>
+        </w:rPr>
+        <w:t>0</w:t>
+      </w:r>
+      <w:r>
+        <w:rPr>
+          <w:rFonts w:hint="eastAsia"/>
+        </w:rPr>
+        <w:t>时，</w:t>
+      </w:r>
+      <w:r>
+        <w:rPr>
+          <w:rFonts w:hint="eastAsia"/>
+        </w:rPr>
+        <w:t>弱点被触发</w:t>
+      </w:r>
+      <w:r>
+        <w:rPr>
+          <w:rFonts w:hint="eastAsia"/>
+        </w:rPr>
+        <w:t>，角色进入弱化状态</w:t>
+      </w:r>
+    </w:p>
+    <w:p>
+      <w:r>
+        <w:rPr>
+          <w:rFonts w:hint="eastAsia"/>
+        </w:rPr>
+        <w:t>使用对应标签的技能攻击对象，可以削减弱点的暴露值</w:t>
       </w:r>
     </w:p>
     <w:p>
       <w:pPr>
         <w:pStyle w:val="Header3"/>
       </w:pPr>
-      <w:bookmarkStart w:id="11" w:name="_Toc183950354"/>
-      <w:r>
-        <w:rPr>
-          <w:rFonts w:hint="eastAsia"/>
-        </w:rPr>
-        <w:t>弱点击破</w:t>
+      <w:bookmarkStart w:id="11" w:name="_Toc183950355"/>
+      <w:r>
+        <w:rPr>
+          <w:rFonts w:hint="eastAsia"/>
+        </w:rPr>
+        <w:t>弱点路线</w:t>
       </w:r>
       <w:bookmarkEnd w:id="11"/>
-    </w:p>
-    <w:p>
-      <w:r>
-        <w:rPr>
-          <w:rFonts w:hint="eastAsia"/>
-        </w:rPr>
-        <w:t>弱点有暴露值：</w:t>
-      </w:r>
-      <w:r>
-        <w:rPr>
-          <w:rFonts w:hint="eastAsia"/>
-        </w:rPr>
-        <w:t>0</w:t>
-      </w:r>
-      <w:r>
-        <w:t>-100</w:t>
-      </w:r>
-    </w:p>
-    <w:p>
-      <w:r>
-        <w:rPr>
-          <w:rFonts w:hint="eastAsia"/>
-        </w:rPr>
-        <w:t>当一个弱点的暴露值为</w:t>
-      </w:r>
-      <w:r>
-        <w:rPr>
-          <w:rFonts w:hint="eastAsia"/>
-        </w:rPr>
-        <w:t>1</w:t>
-      </w:r>
-      <w:r>
-        <w:t>0</w:t>
-      </w:r>
-      <w:r>
-        <w:rPr>
-          <w:rFonts w:hint="eastAsia"/>
-        </w:rPr>
-        <w:t>0</w:t>
-      </w:r>
-      <w:r>
-        <w:rPr>
-          <w:rFonts w:hint="eastAsia"/>
-        </w:rPr>
-        <w:t>时，</w:t>
-      </w:r>
-      <w:r>
-        <w:rPr>
-          <w:rFonts w:hint="eastAsia"/>
-        </w:rPr>
-        <w:t>弱点被触发</w:t>
-      </w:r>
-      <w:r>
-        <w:rPr>
-          <w:rFonts w:hint="eastAsia"/>
-        </w:rPr>
-        <w:t>，角色进入弱化状态</w:t>
-      </w:r>
-    </w:p>
-    <w:p>
-      <w:r>
-        <w:rPr>
-          <w:rFonts w:hint="eastAsia"/>
-        </w:rPr>
-        <w:t>使用对应标签的技能攻击对象，可以削减弱点的暴露值</w:t>
-      </w:r>
-    </w:p>
-    <w:p>
-      <w:pPr>
-        <w:pStyle w:val="Header3"/>
-      </w:pPr>
-      <w:bookmarkStart w:id="12" w:name="_Toc183950355"/>
-      <w:r>
-        <w:rPr>
-          <w:rFonts w:hint="eastAsia"/>
-        </w:rPr>
-        <w:t>弱点路线</w:t>
-      </w:r>
-      <w:bookmarkEnd w:id="12"/>
     </w:p>
     <w:p>
       <w:r>
@@ -2693,7 +2598,7 @@
       <w:pPr>
         <w:pStyle w:val="Header3"/>
       </w:pPr>
-      <w:bookmarkStart w:id="13" w:name="_Toc183950356"/>
+      <w:bookmarkStart w:id="12" w:name="_Toc183950356"/>
       <w:r>
         <w:rPr>
           <w:rFonts w:hint="eastAsia"/>
@@ -2712,40 +2617,40 @@
         </w:rPr>
         <w:t>和恢复</w:t>
       </w:r>
+      <w:bookmarkEnd w:id="12"/>
+    </w:p>
+    <w:p>
+      <w:r>
+        <w:rPr>
+          <w:rFonts w:hint="eastAsia"/>
+        </w:rPr>
+        <w:t>弱点触发后角色进入弱化状态</w:t>
+      </w:r>
+      <w:r>
+        <w:rPr>
+          <w:rFonts w:hint="eastAsia"/>
+        </w:rPr>
+        <w:t>，如果不再被触发弱点，过一段时间后恢复正常状态，并且一段时间内无法再次进入弱化状态</w:t>
+      </w:r>
+    </w:p>
+    <w:p>
+      <w:pPr>
+        <w:pStyle w:val="Header3"/>
+      </w:pPr>
+      <w:bookmarkStart w:id="13" w:name="_Toc183950357"/>
+      <w:r>
+        <w:rPr>
+          <w:rFonts w:hint="eastAsia"/>
+        </w:rPr>
+        <w:t>弱化</w:t>
+      </w:r>
+      <w:r>
+        <w:rPr>
+          <w:rFonts w:hint="eastAsia"/>
+        </w:rPr>
+        <w:t>连击</w:t>
+      </w:r>
       <w:bookmarkEnd w:id="13"/>
-    </w:p>
-    <w:p>
-      <w:r>
-        <w:rPr>
-          <w:rFonts w:hint="eastAsia"/>
-        </w:rPr>
-        <w:t>弱点触发后角色进入弱化状态</w:t>
-      </w:r>
-      <w:r>
-        <w:rPr>
-          <w:rFonts w:hint="eastAsia"/>
-        </w:rPr>
-        <w:t>，如果不再被触发弱点，过一段时间后恢复正常状态，并且一段时间内无法再次进入弱化状态</w:t>
-      </w:r>
-    </w:p>
-    <w:p>
-      <w:pPr>
-        <w:pStyle w:val="Header3"/>
-      </w:pPr>
-      <w:bookmarkStart w:id="14" w:name="_Toc183950357"/>
-      <w:r>
-        <w:rPr>
-          <w:rFonts w:hint="eastAsia"/>
-        </w:rPr>
-        <w:t>弱化</w:t>
-      </w:r>
-      <w:r>
-        <w:rPr>
-          <w:rFonts w:hint="eastAsia"/>
-        </w:rPr>
-        <w:t>连击</w:t>
-      </w:r>
-      <w:bookmarkEnd w:id="14"/>
     </w:p>
     <w:p>
       <w:r>
@@ -2803,48 +2708,48 @@
       <w:pPr>
         <w:pStyle w:val="Header2"/>
       </w:pPr>
-      <w:bookmarkStart w:id="15" w:name="_Toc183950358"/>
+      <w:bookmarkStart w:id="14" w:name="_Toc183950358"/>
       <w:r>
         <w:rPr>
           <w:rFonts w:hint="eastAsia"/>
         </w:rPr>
         <w:t>技能系统</w:t>
       </w:r>
+      <w:bookmarkEnd w:id="14"/>
+    </w:p>
+    <w:p>
+      <w:pPr>
+        <w:pStyle w:val="Header3"/>
+      </w:pPr>
+      <w:bookmarkStart w:id="15" w:name="_Toc183950359"/>
+      <w:r>
+        <w:rPr>
+          <w:rFonts w:hint="eastAsia"/>
+        </w:rPr>
+        <w:t>技能</w:t>
+      </w:r>
       <w:bookmarkEnd w:id="15"/>
     </w:p>
     <w:p>
+      <w:r>
+        <w:rPr>
+          <w:rFonts w:hint="eastAsia"/>
+        </w:rPr>
+        <w:t>玩家使用技能进行攻击，不使用技能时自动普通攻击</w:t>
+      </w:r>
+    </w:p>
+    <w:p>
       <w:pPr>
         <w:pStyle w:val="Header3"/>
       </w:pPr>
-      <w:bookmarkStart w:id="16" w:name="_Toc183950359"/>
-      <w:r>
-        <w:rPr>
-          <w:rFonts w:hint="eastAsia"/>
-        </w:rPr>
-        <w:t>技能</w:t>
+      <w:bookmarkStart w:id="16" w:name="_Toc183950360"/>
+      <w:r>
+        <w:rPr>
+          <w:rFonts w:hint="eastAsia"/>
+        </w:rPr>
+        <w:t>技能组</w:t>
       </w:r>
       <w:bookmarkEnd w:id="16"/>
-    </w:p>
-    <w:p>
-      <w:r>
-        <w:rPr>
-          <w:rFonts w:hint="eastAsia"/>
-        </w:rPr>
-        <w:t>玩家使用技能进行攻击，不使用技能时自动普通攻击</w:t>
-      </w:r>
-    </w:p>
-    <w:p>
-      <w:pPr>
-        <w:pStyle w:val="Header3"/>
-      </w:pPr>
-      <w:bookmarkStart w:id="17" w:name="_Toc183950360"/>
-      <w:r>
-        <w:rPr>
-          <w:rFonts w:hint="eastAsia"/>
-        </w:rPr>
-        <w:t>技能组</w:t>
-      </w:r>
-      <w:bookmarkEnd w:id="17"/>
     </w:p>
     <w:p>
       <w:r>
@@ -3050,15 +2955,111 @@
     </w:p>
     <w:p>
       <w:pPr>
+        <w:pStyle w:val="Header3"/>
+      </w:pPr>
+      <w:r>
+        <w:rPr>
+          <w:rFonts w:hint="eastAsia"/>
+        </w:rPr>
+        <w:t>技能取消</w:t>
+      </w:r>
+    </w:p>
+    <w:p>
+      <w:r>
+        <w:rPr>
+          <w:rFonts w:hint="eastAsia"/>
+        </w:rPr>
+        <w:t>技能释放中在适合的时机按下释放技能按键，可以取消当前技能的后续动作立即释放下一个技能。</w:t>
+      </w:r>
+    </w:p>
+    <w:p>
+      <w:pPr>
+        <w:rPr>
+          <w:rFonts w:hint="eastAsia"/>
+        </w:rPr>
+      </w:pPr>
+      <w:r>
+        <w:rPr>
+          <w:rFonts w:hint="eastAsia"/>
+        </w:rPr>
+        <w:t>技能取消存在完美取消时机，每次完美取消后可以给团队能量充能。</w:t>
+      </w:r>
+    </w:p>
+    <w:p>
+      <w:pPr>
         <w:pStyle w:val="Header2"/>
       </w:pPr>
-      <w:bookmarkStart w:id="18" w:name="_Toc183950361"/>
+      <w:bookmarkStart w:id="17" w:name="_Toc183950361"/>
       <w:r>
         <w:rPr>
           <w:rFonts w:hint="eastAsia"/>
         </w:rPr>
         <w:t>行动值</w:t>
       </w:r>
+      <w:bookmarkEnd w:id="17"/>
+    </w:p>
+    <w:p>
+      <w:r>
+        <w:rPr>
+          <w:rFonts w:hint="eastAsia"/>
+        </w:rPr>
+        <w:t>游戏中名称为“</w:t>
+      </w:r>
+      <w:r>
+        <w:rPr>
+          <w:rFonts w:hint="eastAsia"/>
+          <w:b/>
+        </w:rPr>
+        <w:t>气力</w:t>
+      </w:r>
+      <w:r>
+        <w:rPr>
+          <w:rFonts w:hint="eastAsia"/>
+        </w:rPr>
+        <w:t>”</w:t>
+      </w:r>
+    </w:p>
+    <w:p>
+      <w:r>
+        <w:rPr>
+          <w:rFonts w:hint="eastAsia"/>
+        </w:rPr>
+        <w:t>使用技能需要消耗行动值</w:t>
+      </w:r>
+    </w:p>
+    <w:p>
+      <w:r>
+        <w:rPr>
+          <w:rFonts w:hint="eastAsia"/>
+        </w:rPr>
+        <w:t>击破敌人弱点可以补充行动值</w:t>
+      </w:r>
+    </w:p>
+    <w:p>
+      <w:r>
+        <w:rPr>
+          <w:rFonts w:hint="eastAsia"/>
+        </w:rPr>
+        <w:t>行动值也会随时间</w:t>
+      </w:r>
+      <w:r>
+        <w:rPr>
+          <w:rFonts w:hint="eastAsia"/>
+        </w:rPr>
+        <w:t>回复</w:t>
+      </w:r>
+    </w:p>
+    <w:p>
+      <w:pPr>
+        <w:pStyle w:val="Header2"/>
+      </w:pPr>
+      <w:bookmarkStart w:id="18" w:name="_Toc183950362"/>
+      <w:r>
+        <w:rPr>
+          <w:rFonts w:hint="eastAsia"/>
+        </w:rPr>
+        <w:t>团队能量</w:t>
+      </w:r>
       <w:bookmarkEnd w:id="18"/>
     </w:p>
     <w:p>
@@ -3066,223 +3067,201 @@
         <w:rPr>
           <w:rFonts w:hint="eastAsia"/>
         </w:rPr>
-        <w:t>游戏中名称为“气力”</w:t>
-      </w:r>
-    </w:p>
-    <w:p>
-      <w:r>
-        <w:rPr>
-          <w:rFonts w:hint="eastAsia"/>
-        </w:rPr>
-        <w:t>使用技能需要消耗行动值</w:t>
-      </w:r>
-    </w:p>
-    <w:p>
-      <w:r>
-        <w:rPr>
-          <w:rFonts w:hint="eastAsia"/>
-        </w:rPr>
-        <w:t>击破敌人弱点可以补充行动值</w:t>
-      </w:r>
-    </w:p>
-    <w:p>
-      <w:r>
-        <w:rPr>
-          <w:rFonts w:hint="eastAsia"/>
-        </w:rPr>
-        <w:t>行动值也会随时间</w:t>
-      </w:r>
-      <w:r>
-        <w:rPr>
-          <w:rFonts w:hint="eastAsia"/>
-        </w:rPr>
-        <w:t>回复</w:t>
+        <w:t>游戏中名称为“</w:t>
+      </w:r>
+      <w:r>
+        <w:rPr>
+          <w:rFonts w:hint="eastAsia"/>
+          <w:b/>
+        </w:rPr>
+        <w:t>团队情绪</w:t>
+      </w:r>
+      <w:r>
+        <w:rPr>
+          <w:rFonts w:hint="eastAsia"/>
+        </w:rPr>
+        <w:t>”</w:t>
+      </w:r>
+    </w:p>
+    <w:p>
+      <w:r>
+        <w:rPr>
+          <w:rFonts w:hint="eastAsia"/>
+        </w:rPr>
+        <w:t>击破敌人弱点</w:t>
+      </w:r>
+    </w:p>
+    <w:p>
+      <w:r>
+        <w:rPr>
+          <w:rFonts w:hint="eastAsia"/>
+        </w:rPr>
+        <w:t>成功连击</w:t>
+      </w:r>
+      <w:bookmarkStart w:id="19" w:name="_GoBack"/>
+      <w:bookmarkEnd w:id="19"/>
+    </w:p>
+    <w:p>
+      <w:r>
+        <w:rPr>
+          <w:rFonts w:hint="eastAsia"/>
+        </w:rPr>
+        <w:t>帮助友方</w:t>
+      </w:r>
+    </w:p>
+    <w:p>
+      <w:pPr>
+        <w:rPr>
+          <w:rFonts w:hint="eastAsia"/>
+        </w:rPr>
+      </w:pPr>
+      <w:r>
+        <w:rPr>
+          <w:rFonts w:hint="eastAsia"/>
+        </w:rPr>
+        <w:t>技能完美取消</w:t>
       </w:r>
     </w:p>
     <w:p>
       <w:pPr>
         <w:pStyle w:val="Header2"/>
       </w:pPr>
-      <w:bookmarkStart w:id="19" w:name="_Toc183950362"/>
-      <w:r>
-        <w:rPr>
-          <w:rFonts w:hint="eastAsia"/>
-        </w:rPr>
-        <w:t>团队能量</w:t>
-      </w:r>
-      <w:bookmarkEnd w:id="19"/>
-    </w:p>
-    <w:p>
-      <w:r>
-        <w:rPr>
-          <w:rFonts w:hint="eastAsia"/>
-        </w:rPr>
-        <w:t>游戏中名称为“团队气势”</w:t>
-      </w:r>
-    </w:p>
-    <w:p>
-      <w:r>
-        <w:rPr>
-          <w:rFonts w:hint="eastAsia"/>
-        </w:rPr>
-        <w:t>击破敌人弱点增加团队能量</w:t>
-      </w:r>
-    </w:p>
-    <w:p>
-      <w:r>
-        <w:rPr>
-          <w:rFonts w:hint="eastAsia"/>
-        </w:rPr>
-        <w:t>成功连击增加团队能量</w:t>
-      </w:r>
-    </w:p>
-    <w:p>
-      <w:r>
-        <w:rPr>
-          <w:rFonts w:hint="eastAsia"/>
-        </w:rPr>
-        <w:t>帮助友方增加团队能量</w:t>
+      <w:bookmarkStart w:id="20" w:name="_Toc183950363"/>
+      <w:r>
+        <w:rPr>
+          <w:rFonts w:hint="eastAsia"/>
+        </w:rPr>
+        <w:t>连击系统</w:t>
+      </w:r>
+      <w:bookmarkEnd w:id="20"/>
+    </w:p>
+    <w:p>
+      <w:r>
+        <w:rPr>
+          <w:rFonts w:hint="eastAsia"/>
+        </w:rPr>
+        <w:t>在角色进入弱化状态后，使用决定技击破角色的弱点，达成连击</w:t>
+      </w:r>
+    </w:p>
+    <w:p>
+      <w:r>
+        <w:rPr>
+          <w:rFonts w:hint="eastAsia"/>
+        </w:rPr>
+        <w:t>连击成功，决定技伤害增加</w:t>
+      </w:r>
+    </w:p>
+    <w:p>
+      <w:r>
+        <w:rPr>
+          <w:rFonts w:hint="eastAsia"/>
+        </w:rPr>
+        <w:t>决定技的冷却为</w:t>
+      </w:r>
+      <w:r>
+        <w:t>0</w:t>
+      </w:r>
+    </w:p>
+    <w:p>
+      <w:r>
+        <w:rPr>
+          <w:rFonts w:hint="eastAsia"/>
+        </w:rPr>
+        <w:t>恢复所有</w:t>
+      </w:r>
+      <w:r>
+        <w:t>AP</w:t>
       </w:r>
     </w:p>
     <w:p>
       <w:pPr>
         <w:pStyle w:val="Header2"/>
       </w:pPr>
-      <w:bookmarkStart w:id="20" w:name="_Toc183950363"/>
-      <w:r>
-        <w:rPr>
-          <w:rFonts w:hint="eastAsia"/>
-        </w:rPr>
-        <w:t>连击系统</w:t>
-      </w:r>
-      <w:bookmarkEnd w:id="20"/>
-    </w:p>
-    <w:p>
-      <w:r>
-        <w:rPr>
-          <w:rFonts w:hint="eastAsia"/>
-        </w:rPr>
-        <w:t>在角色进入弱化状态后，使用决定技击破角色的弱点，达成连击</w:t>
-      </w:r>
-    </w:p>
-    <w:p>
-      <w:r>
-        <w:rPr>
-          <w:rFonts w:hint="eastAsia"/>
-        </w:rPr>
-        <w:t>连击成功，决定技伤害增加</w:t>
-      </w:r>
-    </w:p>
-    <w:p>
-      <w:r>
-        <w:rPr>
-          <w:rFonts w:hint="eastAsia"/>
-        </w:rPr>
-        <w:t>决定技的冷却为</w:t>
-      </w:r>
-      <w:r>
-        <w:t>0</w:t>
-      </w:r>
-    </w:p>
-    <w:p>
-      <w:r>
-        <w:rPr>
-          <w:rFonts w:hint="eastAsia"/>
-        </w:rPr>
-        <w:t>恢复所有</w:t>
+      <w:bookmarkStart w:id="21" w:name="_Toc183950364"/>
+      <w:r>
+        <w:rPr>
+          <w:rFonts w:hint="eastAsia"/>
+        </w:rPr>
+        <w:t>决定计系统</w:t>
+      </w:r>
+      <w:bookmarkEnd w:id="21"/>
+    </w:p>
+    <w:p>
+      <w:r>
+        <w:rPr>
+          <w:rFonts w:hint="eastAsia"/>
+        </w:rPr>
+        <w:t>释放需要满足条件：</w:t>
+      </w:r>
+    </w:p>
+    <w:p>
+      <w:r>
+        <w:rPr>
+          <w:rFonts w:hint="eastAsia"/>
+        </w:rPr>
+        <w:t>1</w:t>
+      </w:r>
+      <w:r>
+        <w:rPr>
+          <w:rFonts w:hint="eastAsia"/>
+        </w:rPr>
+        <w:t>消耗所有</w:t>
       </w:r>
       <w:r>
         <w:t>AP</w:t>
       </w:r>
     </w:p>
     <w:p>
+      <w:r>
+        <w:t>2</w:t>
+      </w:r>
+      <w:r>
+        <w:rPr>
+          <w:rFonts w:hint="eastAsia"/>
+        </w:rPr>
+        <w:t>冷却结束</w:t>
+      </w:r>
+    </w:p>
+    <w:p>
+      <w:r>
+        <w:rPr>
+          <w:rFonts w:hint="eastAsia"/>
+        </w:rPr>
+        <w:t>释放后需要冷却一段时间</w:t>
+      </w:r>
+    </w:p>
+    <w:p>
+      <w:r>
+        <w:rPr>
+          <w:rFonts w:hint="eastAsia"/>
+        </w:rPr>
+        <w:lastRenderedPageBreak/>
+        <w:t>一段时间内无法恢复</w:t>
+      </w:r>
+      <w:r>
+        <w:t>AP</w:t>
+      </w:r>
+    </w:p>
+    <w:p>
+      <w:r>
+        <w:rPr>
+          <w:rFonts w:hint="eastAsia"/>
+        </w:rPr>
+        <w:t>决定技可以释放时，决定技高亮</w:t>
+      </w:r>
+    </w:p>
+    <w:p>
+      <w:r>
+        <w:rPr>
+          <w:rFonts w:hint="eastAsia"/>
+        </w:rPr>
+        <w:t>决定技不可以释放时，决定技灰暗</w:t>
+      </w:r>
+    </w:p>
+    <w:p>
       <w:pPr>
         <w:pStyle w:val="Header2"/>
       </w:pPr>
-      <w:bookmarkStart w:id="21" w:name="_Toc183950364"/>
-      <w:r>
-        <w:rPr>
-          <w:rFonts w:hint="eastAsia"/>
-        </w:rPr>
-        <w:t>决定计系统</w:t>
-      </w:r>
-      <w:bookmarkEnd w:id="21"/>
-    </w:p>
-    <w:p>
-      <w:r>
-        <w:rPr>
-          <w:rFonts w:hint="eastAsia"/>
-        </w:rPr>
-        <w:t>释放需要满足条件：</w:t>
-      </w:r>
-    </w:p>
-    <w:p>
-      <w:r>
-        <w:rPr>
-          <w:rFonts w:hint="eastAsia"/>
-        </w:rPr>
-        <w:t>1</w:t>
-      </w:r>
-      <w:r>
-        <w:rPr>
-          <w:rFonts w:hint="eastAsia"/>
-        </w:rPr>
-        <w:t>消耗所有</w:t>
-      </w:r>
-      <w:r>
-        <w:t>AP</w:t>
-      </w:r>
-    </w:p>
-    <w:p>
-      <w:r>
-        <w:t>2</w:t>
-      </w:r>
-      <w:r>
-        <w:rPr>
-          <w:rFonts w:hint="eastAsia"/>
-        </w:rPr>
-        <w:t>冷却结束</w:t>
-      </w:r>
-    </w:p>
-    <w:p>
-      <w:r>
-        <w:rPr>
-          <w:rFonts w:hint="eastAsia"/>
-        </w:rPr>
-        <w:t>释放后需要冷却一段时间</w:t>
-      </w:r>
-    </w:p>
-    <w:p>
-      <w:r>
-        <w:rPr>
-          <w:rFonts w:hint="eastAsia"/>
-        </w:rPr>
-        <w:t>一段时间内无法恢复</w:t>
-      </w:r>
-      <w:r>
-        <w:t>AP</w:t>
-      </w:r>
-    </w:p>
-    <w:p>
-      <w:r>
-        <w:rPr>
-          <w:rFonts w:hint="eastAsia"/>
-        </w:rPr>
-        <w:t>决定技可以释放时，决定技高亮</w:t>
-      </w:r>
-    </w:p>
-    <w:p>
-      <w:r>
-        <w:rPr>
-          <w:rFonts w:hint="eastAsia"/>
-        </w:rPr>
-        <w:t>决定技不可以释放时，决定技灰暗</w:t>
-      </w:r>
-    </w:p>
-    <w:p>
-      <w:pPr>
-        <w:pStyle w:val="Header2"/>
-      </w:pPr>
       <w:bookmarkStart w:id="22" w:name="_Toc183950365"/>
       <w:r>
         <w:rPr>
@@ -3297,7 +3276,6 @@
         <w:rPr>
           <w:rFonts w:hint="eastAsia"/>
         </w:rPr>
-        <w:lastRenderedPageBreak/>
         <w:t>战斗中，存在可以交互的环境，满足可交互环境的条件，可以触发相应的环境效果，</w:t>
       </w:r>
       <w:r>
@@ -4729,7 +4707,7 @@
 </file>
 
 <file path=customXml/itemProps1.xml><?xml version="1.0" encoding="utf-8"?>
-<ds:datastoreItem xmlns:ds="http://schemas.openxmlformats.org/officeDocument/2006/customXml" ds:itemID="{26A8450B-8869-44F8-A666-F77E477EBAF7}">
+<ds:datastoreItem xmlns:ds="http://schemas.openxmlformats.org/officeDocument/2006/customXml" ds:itemID="{090783A8-9DFF-4B0C-A3DF-286B0BD561E6}">
   <ds:schemaRefs>
     <ds:schemaRef ds:uri="http://schemas.openxmlformats.org/officeDocument/2006/bibliography"/>
   </ds:schemaRefs>

</xml_diff>